<commit_message>
Hợp đồng OEM: công thức thuộc DS, Shizencos bàn giao toàn bộ hồ sơ công thức sau ký; giai đoạn đàm phán chỉ cam kết thành phần chủ chốt không tăng giá
Co-Authored-By: Claude Opus 5.5 <noreply@anthropic.com>
Claude-Session: https://claude.ai/code/session_01GKZ691fwJKdai4y2ykkrnF
</commit_message>
<xml_diff>
--- a/DS CORPORATION/OEM/SHIZENCOS/BAO CAO/01_BaoCao_Hop_ThuongThao_Shizencos_SKU1_09102026.docx
+++ b/DS CORPORATION/OEM/SHIZENCOS/BAO CAO/01_BaoCao_Hop_ThuongThao_Shizencos_SKU1_09102026.docx
@@ -330,7 +330,7 @@
                 <w:b w:val="0"/>
                 <w:sz w:val="18"/>
               </w:rPr>
-              <w:t>Đánh giá V3 so với benchmark, yêu cầu hàm lượng thành phần chủ chốt (Shizencos bảo mật %), rà soát hợp đồng, lộ trình pháp lý – công bố – sản xuất và bộ câu hỏi cho buổi họp</w:t>
+              <w:t>Đánh giá V3 so với benchmark, thành phần chủ chốt &amp; bàn giao công thức theo Hợp đồng OEM, rà soát hợp đồng, lộ trình pháp lý – công bố – sản xuất và bộ câu hỏi cho buổi họp</w:t>
             </w:r>
           </w:p>
         </w:tc>
@@ -475,7 +475,7 @@
           <w:b w:val="0"/>
           <w:sz w:val="19"/>
         </w:rPr>
-        <w:t xml:space="preserve">   4. Thành phần chủ chốt: hàm lượng bắt buộc, chi phí, kiểm soát</w:t>
+        <w:t xml:space="preserve">   4. Thành phần chủ chốt (đàm phán) &amp; bàn giao công thức (sau ký HĐ OEM)</w:t>
       </w:r>
     </w:p>
     <w:p>
@@ -763,14 +763,14 @@
                 <w:b/>
                 <w:sz w:val="18"/>
               </w:rPr>
-              <w:t>Chỉ yêu cầu hàm lượng 08 thành phần chủ chốt</w:t>
+              <w:t>Đàm phán:</w:t>
             </w:r>
             <w:r>
               <w:rPr>
                 <w:b w:val="0"/>
                 <w:sz w:val="18"/>
               </w:rPr>
-              <w:t xml:space="preserve">, không đòi % toàn công thức, </w:t>
+              <w:t xml:space="preserve"> chỉ đề nghị Shizencos bảo đảm 08 thành phần chủ chốt trong khoảng % có tác dụng như benchmark, </w:t>
             </w:r>
             <w:r>
               <w:rPr>
@@ -779,6 +779,27 @@
               </w:rPr>
               <w:t>giữ đơn giá 59.800 đ/hộp</w:t>
             </w:r>
+            <w:r>
+              <w:rPr>
+                <w:b w:val="0"/>
+                <w:sz w:val="18"/>
+              </w:rPr>
+              <w:t xml:space="preserve">. </w:t>
+            </w:r>
+            <w:r>
+              <w:rPr>
+                <w:b/>
+                <w:sz w:val="18"/>
+              </w:rPr>
+              <w:t>Sau ký HĐ OEM:</w:t>
+            </w:r>
+            <w:r>
+              <w:rPr>
+                <w:b w:val="0"/>
+                <w:sz w:val="18"/>
+              </w:rPr>
+              <w:t xml:space="preserve"> Shizencos bàn giao toàn bộ công thức định lượng, quy trình, hồ sơ nguyên liệu; công thức thuộc DS</w:t>
+            </w:r>
           </w:p>
         </w:tc>
         <w:tc>
@@ -795,7 +816,7 @@
                 <w:b w:val="0"/>
                 <w:sz w:val="18"/>
               </w:rPr>
-              <w:t>Shizencos bảo mật công thức; đổi % toàn bộ sẽ làm tăng giá. Các mức tối thiểu đặt ở ngưỡng benchmark nên Shizencos có thể đáp ứng trong giá hiện tại</w:t>
+              <w:t>Đang đàm phán nên Shizencos chưa công khai %; đổi % toàn bộ sẽ tăng giá. Sau ký, DS là chủ sở hữu công thức (OEM) và là tổ chức đứng tên công bố phải tự lưu PIF có công thức định lượng (Thông tư 06/2011)</w:t>
             </w:r>
           </w:p>
         </w:tc>
@@ -2309,7 +2330,7 @@
                 <w:b w:val="0"/>
                 <w:sz w:val="18"/>
               </w:rPr>
-              <w:t>Shizencos giữ công thức » DS khó kiểm tra chất lượng</w:t>
+              <w:t>Shizencos không bàn giao công thức sau ký » DS phụ thuộc nhà máy, không đủ PIF</w:t>
             </w:r>
           </w:p>
         </w:tc>
@@ -2327,7 +2348,7 @@
                 <w:b w:val="0"/>
                 <w:sz w:val="18"/>
               </w:rPr>
-              <w:t>Cam kết hàm lượng chủ chốt + kiểm Bakuchiol (HPLC) + mẫu chốt + mẫu lưu</w:t>
+              <w:t>Điều khoản bàn giao Hồ sơ công thức trong 05 ngày làm việc sau ký, trước khi ký mẫu chốt; công thức thuộc DS (Mức 1 – phải đạt)</w:t>
             </w:r>
           </w:p>
         </w:tc>
@@ -4739,7 +4760,7 @@
                 <w:b w:val="0"/>
                 <w:sz w:val="19"/>
               </w:rPr>
-              <w:t xml:space="preserve"> với % hiện tại (Shizencos bảo mật), và có thể đạt </w:t>
+              <w:t xml:space="preserve"> với % hiện tại (Shizencos chưa công khai trong giai đoạn đàm phán), và có thể đạt </w:t>
             </w:r>
             <w:r>
               <w:rPr>
@@ -4783,7 +4804,7 @@
         <w:pStyle w:val="Heading1"/>
       </w:pPr>
       <w:r>
-        <w:t>4. THÀNH PHẦN CHỦ CHỐT: HÀM LƯỢNG BẮT BUỘC, CHI PHÍ, KIỂM SOÁT</w:t>
+        <w:t>4. THÀNH PHẦN CHỦ CHỐT (ĐÀM PHÁN) &amp; BÀN GIAO CÔNG THỨC (SAU KÝ HĐ OEM)</w:t>
       </w:r>
     </w:p>
     <w:tbl>
@@ -4826,7 +4847,14 @@
                 <w:b w:val="0"/>
                 <w:sz w:val="19"/>
               </w:rPr>
-              <w:t xml:space="preserve"> Chỉ ràng buộc 08 thành phần quyết định công dụng (Amla, Bakuchiol, Hương thảo, Tràm trà, Neem, Chùm ngây, Bisabolol, Tocopherol) + 5 giới hạn an toàn. Thành phần nền do Shizencos tự cân đối để đạt tiêu chí cảm quan. Mức tối thiểu ≈ ngưỡng benchmark nên không phải tăng giá.</w:t>
+              <w:t xml:space="preserve"> Chỉ ràng buộc 08 thành phần quyết định công dụng (Amla, Bakuchiol, Hương thảo, Tràm trà, Neem, Chùm ngây, Bisabolol, Tocopherol) + 5 giới hạn an toàn. Thành phần nền do Shizencos tự cân đối để đạt tiêu chí cảm quan. Mức tối thiểu ≈ ngưỡng benchmark nên không phải tăng giá. </w:t>
+            </w:r>
+            <w:r>
+              <w:rPr>
+                <w:b/>
+                <w:sz w:val="19"/>
+              </w:rPr>
+              <w:t>Đây là cách làm trong giai đoạn đàm phán; sau khi ký HĐ OEM, Shizencos phải bàn giao toàn bộ công thức định lượng cho DS (công thức thuộc DS).</w:t>
             </w:r>
           </w:p>
         </w:tc>
@@ -4854,13 +4882,13 @@
         <w:rPr>
           <w:b/>
         </w:rPr>
-        <w:t>Không đòi % toàn công thức</w:t>
+        <w:t>Giai đoạn đàm phán:</w:t>
       </w:r>
       <w:r>
         <w:rPr>
           <w:b w:val="0"/>
         </w:rPr>
-        <w:t xml:space="preserve"> (Shizencos bảo mật) và </w:t>
+        <w:t xml:space="preserve"> chưa đòi % toàn công thức (Shizencos chưa công khai) và </w:t>
       </w:r>
       <w:r>
         <w:rPr>
@@ -4872,7 +4900,49 @@
         <w:rPr>
           <w:b w:val="0"/>
         </w:rPr>
-        <w:t xml:space="preserve"> (đổi sẽ tăng giá).</w:t>
+        <w:t xml:space="preserve"> (đổi sẽ tăng giá); chỉ đề nghị bảo đảm thành phần chủ chốt </w:t>
+      </w:r>
+      <w:r>
+        <w:rPr>
+          <w:b/>
+        </w:rPr>
+        <w:t>trong đơn giá hiện tại</w:t>
+      </w:r>
+      <w:r>
+        <w:rPr>
+          <w:b w:val="0"/>
+        </w:rPr>
+        <w:t>.</w:t>
+      </w:r>
+    </w:p>
+    <w:p>
+      <w:pPr>
+        <w:pStyle w:val="ListBullet"/>
+        <w:spacing w:after="20"/>
+      </w:pPr>
+      <w:r>
+        <w:rPr>
+          <w:b/>
+        </w:rPr>
+        <w:t>Sau ký Hợp đồng OEM:</w:t>
+      </w:r>
+      <w:r>
+        <w:rPr>
+          <w:b w:val="0"/>
+        </w:rPr>
+        <w:t xml:space="preserve"> Shizencos bàn giao </w:t>
+      </w:r>
+      <w:r>
+        <w:rPr>
+          <w:b/>
+        </w:rPr>
+        <w:t>Hồ sơ công thức siêu chi tiết</w:t>
+      </w:r>
+      <w:r>
+        <w:rPr>
+          <w:b w:val="0"/>
+        </w:rPr>
+        <w:t xml:space="preserve"> (định lượng 100%, CAS, NCC, grade, quy trình, IPC, spec/COA) trong 05 ngày làm việc, trước khi ký mẫu chốt; công thức thuộc sở hữu DS.</w:t>
       </w:r>
     </w:p>
     <w:p>
@@ -7475,7 +7545,7 @@
         <w:pStyle w:val="Heading2"/>
       </w:pPr>
       <w:r>
-        <w:t>4.4 DS kiểm chứng như thế nào khi không biết %</w:t>
+        <w:t>4.4 Kiểm chứng: trước và sau khi ký hợp đồng</w:t>
       </w:r>
     </w:p>
     <w:tbl>
@@ -7726,6 +7796,44 @@
                 <w:b w:val="0"/>
                 <w:sz w:val="17"/>
               </w:rPr>
+              <w:t>Bàn giao công thức (sau ký)</w:t>
+            </w:r>
+          </w:p>
+        </w:tc>
+        <w:tc>
+          <w:tcPr>
+            <w:tcW w:type="dxa" w:w="7824"/>
+          </w:tcPr>
+          <w:p>
+            <w:pPr>
+              <w:spacing w:after="0"/>
+            </w:pPr>
+            <w:r/>
+            <w:r>
+              <w:rPr>
+                <w:b w:val="0"/>
+                <w:sz w:val="17"/>
+              </w:rPr>
+              <w:t>Bảng định lượng 100% + quy trình + IPC + hồ sơ nguyên liệu (Phụ lục 01 mục D) – DS đối chiếu trực tiếp % thành phần chủ chốt</w:t>
+            </w:r>
+          </w:p>
+        </w:tc>
+      </w:tr>
+      <w:tr>
+        <w:tc>
+          <w:tcPr>
+            <w:tcW w:type="dxa" w:w="2041"/>
+          </w:tcPr>
+          <w:p>
+            <w:pPr>
+              <w:spacing w:after="0"/>
+            </w:pPr>
+            <w:r/>
+            <w:r>
+              <w:rPr>
+                <w:b w:val="0"/>
+                <w:sz w:val="17"/>
+              </w:rPr>
               <w:t>PIF</w:t>
             </w:r>
           </w:p>
@@ -7744,7 +7852,7 @@
                 <w:b w:val="0"/>
                 <w:sz w:val="17"/>
               </w:rPr>
-              <w:t>Shizencos giữ phần công thức định lượng, xuất trình cho cơ quan quản lý trong 03 ngày làm việc (Điều 06 HĐ)</w:t>
+              <w:t>Shizencos bàn giao PIF đầy đủ, gồm công thức định lượng, để DS lưu tại địa chỉ DS (Điều 06 HĐ)</w:t>
             </w:r>
           </w:p>
         </w:tc>
@@ -13614,7 +13722,7 @@
                 <w:b w:val="0"/>
                 <w:sz w:val="15"/>
               </w:rPr>
-              <w:t>Điều 1 – Yêu cầu kỹ thuật công thức</w:t>
+              <w:t>Điều 1 – Yêu cầu kỹ thuật &amp; bàn giao công thức (OEM)</w:t>
             </w:r>
           </w:p>
         </w:tc>
@@ -13633,7 +13741,7 @@
                 <w:b w:val="0"/>
                 <w:sz w:val="15"/>
               </w:rPr>
-              <w:t>Dự thảo chỉ ghi LOT công thức, không có căn cứ bảo đảm công dụng và kiểm tra chất lượng. Bên A vẫn được bảo mật tỷ lệ công thức.</w:t>
+              <w:t>Hợp đồng OEM: Bên B là chủ thương hiệu, đặt hàng và trả chi phí phát triển, đồng thời là tổ chức đứng tên công bố phải lưu giữ PIF (gồm công thức định lượng) tại địa chỉ của mình. Dự thảo chỉ ghi LOT công thức, không có nghĩa vụ bàn giao công thức và không xác định quyền sở hữu công thức.</w:t>
             </w:r>
           </w:p>
         </w:tc>
@@ -13652,7 +13760,7 @@
                 <w:b w:val="0"/>
                 <w:sz w:val="15"/>
               </w:rPr>
-              <w:t>Luật Thương mại 2005 Điều 178, 181 (bên đặt gia công được kiểm tra chất lượng); Hiệp định mỹ phẩm ASEAN</w:t>
+              <w:t>Luật Thương mại 2005 Điều 178–181 (gia công theo yêu cầu của bên đặt gia công; quyền kiểm tra); BLDS 2015 Điều 542; Thông tư 06/2011/TT-BYT (PIF lưu tại tổ chức chịu trách nhiệm đưa sản phẩm ra thị trường); Luật Sở hữu trí tuệ (bí mật kinh doanh)</w:t>
             </w:r>
           </w:p>
         </w:tc>
@@ -14312,7 +14420,7 @@
                 <w:b w:val="0"/>
                 <w:sz w:val="15"/>
               </w:rPr>
-              <w:t>Mức “bồi thường 50% giá trị đơn hàng bên thứ ba” là khoản ấn định, không gắn với thiệt hại thực tế; chỉ áp dụng một chiều.</w:t>
+              <w:t>Mức “bồi thường 50% giá trị đơn hàng bên thứ ba” là khoản ấn định, không gắn với thiệt hại thực tế. Bên B là chủ sở hữu công thức (Hợp đồng OEM) nên có quyền sản xuất tại đơn vị khác khi chấm dứt hợp tác, chỉ cần công bố mới đúng quy định.</w:t>
             </w:r>
           </w:p>
         </w:tc>
@@ -14700,7 +14808,7 @@
                 <w:b w:val="0"/>
                 <w:sz w:val="15"/>
               </w:rPr>
-              <w:t>Bảo mật chung chung, không thời hạn; chưa bảo vệ nhãn hiệu, thiết kế của Bên B và đầu tư phát triển công thức; chưa có điều khoản phạt vi phạm chung đúng luật.</w:t>
+              <w:t>Bảo mật chung chung, không thời hạn; chưa bảo vệ nhãn hiệu, thiết kế và công thức thuộc sở hữu của Bên B; chưa có điều khoản phạt vi phạm chung đúng luật.</w:t>
             </w:r>
           </w:p>
         </w:tc>
@@ -17135,6 +17243,24 @@
       </w:pPr>
       <w:r>
         <w:t>7.3 Chiến lược thương thảo</w:t>
+      </w:r>
+    </w:p>
+    <w:p>
+      <w:pPr>
+        <w:pStyle w:val="ListBullet"/>
+        <w:spacing w:after="20"/>
+      </w:pPr>
+      <w:r>
+        <w:rPr>
+          <w:b/>
+        </w:rPr>
+        <w:t>Cách nói về công thức:</w:t>
+      </w:r>
+      <w:r>
+        <w:rPr>
+          <w:b w:val="0"/>
+        </w:rPr>
+        <w:t xml:space="preserve"> “Hiện đang đàm phán nên DS chưa đề nghị công khai %. DS chỉ mong Shizencos bảo đảm 08 thành phần chủ chốt nằm trong khoảng có tác dụng như benchmark, trong đúng đơn giá đã báo. Khi ký HĐ OEM thì công thức là của DS, Shizencos bàn giao đầy đủ – điều này cũng bắt buộc vì DS đứng tên công bố phải lưu PIF có công thức định lượng.”</w:t>
       </w:r>
     </w:p>
     <w:p>
@@ -17272,7 +17398,19 @@
         <w:rPr>
           <w:b w:val="0"/>
         </w:rPr>
-        <w:t xml:space="preserve"> nếu Shizencos không chấp nhận: DS đứng tên công bố; bỏ quyền thu hồi số công bố; cam kết thành phần chủ chốt (Phụ lục 01); phạt ≤ 8%; bỏ “bồi thường 50%”; không thanh lý hàng mang nhãn DS; nộp Giấy CN đủ điều kiện sản xuất.</w:t>
+        <w:t xml:space="preserve"> nếu Shizencos không chấp nhận: DS đứng tên công bố; bỏ quyền thu hồi số công bố; cam kết thành phần chủ chốt không tăng giá (Phụ lục 01); </w:t>
+      </w:r>
+      <w:r>
+        <w:rPr>
+          <w:b/>
+        </w:rPr>
+        <w:t>bàn giao toàn bộ công thức sau ký và công thức thuộc DS</w:t>
+      </w:r>
+      <w:r>
+        <w:rPr>
+          <w:b w:val="0"/>
+        </w:rPr>
+        <w:t>; bàn giao PIF đầy đủ; phạt ≤ 8%; bỏ “bồi thường 50%”; không thanh lý hàng mang nhãn DS; nộp Giấy CN đủ điều kiện sản xuất.</w:t>
       </w:r>
     </w:p>
     <w:tbl>
@@ -18875,7 +19013,7 @@
           <w:b w:val="0"/>
           <w:sz w:val="19"/>
         </w:rPr>
-        <w:t xml:space="preserve"> (*) Phần công thức định lượng trong PIF: Shizencos lưu và cam kết xuất trình cho cơ quan quản lý trong bao lâu khi DS đứng tên công bố?</w:t>
+        <w:t xml:space="preserve"> (*) Shizencos có đồng ý: sau ký HĐ OEM bàn giao Hồ sơ công thức đầy đủ (định lượng 100%, CAS, NCC, grade, quy trình, IPC) trong 05 ngày làm việc, công thức thuộc sở hữu DS, và bàn giao PIF đầy đủ cho DS lưu giữ?</w:t>
       </w:r>
     </w:p>
     <w:p>

</xml_diff>

<commit_message>
Đổi vai trò hợp đồng theo thông lệ OEM: DS là Bên A (bên đặt gia công), Shizencos là Bên B
Track changes toàn bộ ký hiệu Bên A/B, đưa khối DS lên trước, thêm tài khoản DS, chữ ký DS bên trái; cập nhật biên bản thương thảo và báo cáo.

Co-Authored-By: Claude Opus 5.5 <noreply@anthropic.com>
Claude-Session: https://claude.ai/code/session_01GKZ691fwJKdai4y2ykkrnF
</commit_message>
<xml_diff>
--- a/DS CORPORATION/OEM/SHIZENCOS/BAO CAO/01_BaoCao_Hop_ThuongThao_Shizencos_SKU1_09102026.docx
+++ b/DS CORPORATION/OEM/SHIZENCOS/BAO CAO/01_BaoCao_Hop_ThuongThao_Shizencos_SKU1_09102026.docx
@@ -395,7 +395,7 @@
                 <w:b w:val="0"/>
                 <w:sz w:val="19"/>
               </w:rPr>
-              <w:t xml:space="preserve"> – chính dự thảo hợp đồng của Shizencos, DS sửa trực tiếp bằng Track Changes (giữ Bên A = Shizencos, Bên B = DS) và bổ sung Phụ lục 01–03; (3) </w:t>
+              <w:t xml:space="preserve"> – chính dự thảo hợp đồng của Shizencos, DS sửa trực tiếp bằng Track Changes, đổi vai trò theo thông lệ (Bên A = DS – bên đặt gia công; Bên B = Shizencos – bên nhận gia công) và bổ sung Phụ lục 01–03; (3) </w:t>
             </w:r>
             <w:r>
               <w:rPr>
@@ -10999,7 +10999,7 @@
                 <w:b w:val="0"/>
                 <w:sz w:val="17"/>
               </w:rPr>
-              <w:t>Số công bố &amp; PIF thuộc DS; chủ động khi bán trên sàn TMĐT, quảng cáo; phù hợp Điều 7 dự thảo HĐ (“số công bố thuộc quyền sở hữu Bên B”)</w:t>
+              <w:t>Số công bố &amp; PIF thuộc DS; chủ động khi bán trên sàn TMĐT, quảng cáo; phù hợp Điều 7 dự thảo gốc (“số công bố thuộc quyền sở hữu” của DS)</w:t>
             </w:r>
           </w:p>
         </w:tc>
@@ -11799,7 +11799,7 @@
                 <w:b w:val="0"/>
                 <w:sz w:val="17"/>
               </w:rPr>
-              <w:t>Theo biểu phí hiện hành (tham khảo 500.000đ/sản phẩm) – xác nhận ai chịu: HĐ ghi Bên A “có nghĩa vụ hoàn thành việc công bố”</w:t>
+              <w:t>Theo biểu phí hiện hành (tham khảo 500.000đ/sản phẩm) – xác nhận ai chịu: dự thảo gốc ghi Shizencos “có nghĩa vụ hoàn thành việc công bố”</w:t>
             </w:r>
           </w:p>
         </w:tc>
@@ -13114,7 +13114,21 @@
                 <w:b w:val="0"/>
                 <w:sz w:val="19"/>
               </w:rPr>
-              <w:t xml:space="preserve"> (giữ nguyên Bên A = Shizencos – bên nhận gia công; Bên B = DS – bên đặt gia công) và bổ sung 03 phụ lục. Có 40 nhóm sửa đổi, mỗi nhóm có căn cứ pháp lý, được liệt kê trong biên bản thương thảo Excel. Cột ưu tiên dưới đây chỉ dùng nội bộ, </w:t>
+              <w:t xml:space="preserve"> và </w:t>
+            </w:r>
+            <w:r>
+              <w:rPr>
+                <w:b/>
+                <w:sz w:val="19"/>
+              </w:rPr>
+              <w:t>đổi vai trò theo thông lệ OEM: Bên A = DS (bên đặt gia công, chủ thương hiệu), Bên B = Shizencos (bên nhận gia công)</w:t>
+            </w:r>
+            <w:r>
+              <w:rPr>
+                <w:b w:val="0"/>
+                <w:sz w:val="19"/>
+              </w:rPr>
+              <w:t xml:space="preserve">; khối thông tin DS đưa lên trước, chữ ký DS bên trái. Có 41 nhóm sửa đổi, mỗi nhóm có căn cứ pháp lý, được liệt kê trong biên bản thương thảo Excel. Lưu ý: dự thảo gốc của Shizencos ghi ngược lại (Bên A = Shizencos), các trích dẫn “dự thảo gốc” trong báo cáo giữ nguyên ký hiệu cũ. Cột ưu tiên dưới đây chỉ dùng nội bộ, </w:t>
             </w:r>
             <w:r>
               <w:rPr>
@@ -13234,7 +13248,7 @@
         <w:rPr>
           <w:b w:val="0"/>
         </w:rPr>
-        <w:t xml:space="preserve"> (Điều 06) – mâu thuẫn với Điều 07 của chính dự thảo (“số công bố thuộc quyền sở hữu của Bên B”).</w:t>
+        <w:t xml:space="preserve"> (Điều 06) – mâu thuẫn với Điều 07 của chính dự thảo (số công bố thuộc quyền sở hữu của DS).</w:t>
       </w:r>
     </w:p>
     <w:p>
@@ -13509,7 +13523,7 @@
                 <w:b w:val="0"/>
                 <w:sz w:val="15"/>
               </w:rPr>
-              <w:t>4</w:t>
+              <w:t>5</w:t>
             </w:r>
           </w:p>
         </w:tc>
@@ -13606,7 +13620,7 @@
                 <w:b w:val="0"/>
                 <w:sz w:val="15"/>
               </w:rPr>
-              <w:t>7</w:t>
+              <w:t>8</w:t>
             </w:r>
           </w:p>
         </w:tc>
@@ -13703,7 +13717,7 @@
                 <w:b w:val="0"/>
                 <w:sz w:val="15"/>
               </w:rPr>
-              <w:t>11</w:t>
+              <w:t>12</w:t>
             </w:r>
           </w:p>
         </w:tc>
@@ -13741,7 +13755,7 @@
                 <w:b w:val="0"/>
                 <w:sz w:val="15"/>
               </w:rPr>
-              <w:t>Hợp đồng OEM: Bên B là chủ thương hiệu, đặt hàng và trả chi phí phát triển, đồng thời là tổ chức đứng tên công bố phải lưu giữ PIF (gồm công thức định lượng) tại địa chỉ của mình. Dự thảo chỉ ghi LOT công thức, không có nghĩa vụ bàn giao công thức và không xác định quyền sở hữu công thức.</w:t>
+              <w:t>Hợp đồng OEM: Bên A là chủ thương hiệu, đặt hàng và trả chi phí phát triển, đồng thời là tổ chức đứng tên công bố phải lưu giữ PIF (gồm công thức định lượng) tại địa chỉ của mình. Dự thảo chỉ ghi LOT công thức, không có nghĩa vụ bàn giao công thức và không xác định quyền sở hữu công thức.</w:t>
             </w:r>
           </w:p>
         </w:tc>
@@ -13800,7 +13814,7 @@
                 <w:b w:val="0"/>
                 <w:sz w:val="15"/>
               </w:rPr>
-              <w:t>14</w:t>
+              <w:t>15</w:t>
             </w:r>
           </w:p>
         </w:tc>
@@ -13838,7 +13852,7 @@
                 <w:b w:val="0"/>
                 <w:sz w:val="15"/>
               </w:rPr>
-              <w:t>Bên A cung cấp toàn bộ nguyên liệu nhưng chưa có nghĩa vụ hồ sơ nguyên liệu (cần cho PIF, ghi nhãn allergen).</w:t>
+              <w:t>Bên B cung cấp toàn bộ nguyên liệu nhưng chưa có nghĩa vụ hồ sơ nguyên liệu (cần cho PIF, ghi nhãn allergen).</w:t>
             </w:r>
           </w:p>
         </w:tc>
@@ -13897,7 +13911,7 @@
                 <w:b w:val="0"/>
                 <w:sz w:val="15"/>
               </w:rPr>
-              <w:t>18</w:t>
+              <w:t>19</w:t>
             </w:r>
           </w:p>
         </w:tc>
@@ -13994,7 +14008,7 @@
                 <w:b w:val="0"/>
                 <w:sz w:val="15"/>
               </w:rPr>
-              <w:t>19</w:t>
+              <w:t>20</w:t>
             </w:r>
           </w:p>
         </w:tc>
@@ -14091,7 +14105,7 @@
                 <w:b w:val="0"/>
                 <w:sz w:val="15"/>
               </w:rPr>
-              <w:t>21</w:t>
+              <w:t>22</w:t>
             </w:r>
           </w:p>
         </w:tc>
@@ -14129,7 +14143,7 @@
                 <w:b w:val="0"/>
                 <w:sz w:val="15"/>
               </w:rPr>
-              <w:t>Bên A chỉ “phối hợp xử lý” trong 15–30 ngày, không có nghĩa vụ đổi hàng, hoàn tiền, bồi thường; chưa có cơ chế giám định và mẫu lưu.</w:t>
+              <w:t>Bên B chỉ “phối hợp xử lý” trong 15–30 ngày, không có nghĩa vụ đổi hàng, hoàn tiền, bồi thường; chưa có cơ chế giám định và mẫu lưu.</w:t>
             </w:r>
           </w:p>
         </w:tc>
@@ -14188,7 +14202,7 @@
                 <w:b w:val="0"/>
                 <w:sz w:val="15"/>
               </w:rPr>
-              <w:t>23</w:t>
+              <w:t>24</w:t>
             </w:r>
           </w:p>
         </w:tc>
@@ -14285,7 +14299,7 @@
                 <w:b w:val="0"/>
                 <w:sz w:val="15"/>
               </w:rPr>
-              <w:t>27</w:t>
+              <w:t>28</w:t>
             </w:r>
           </w:p>
         </w:tc>
@@ -14323,7 +14337,7 @@
                 <w:b w:val="0"/>
                 <w:sz w:val="15"/>
               </w:rPr>
-              <w:t>Bên A được đơn phương yêu cầu thu hồi số công bố của Bên B » hàng đang lưu hành bị ảnh hưởng, mâu thuẫn Điều 7 (“số công bố thuộc quyền sở hữu của Bên B”).</w:t>
+              <w:t>Bên B được đơn phương yêu cầu thu hồi số công bố của Bên A » hàng đang lưu hành bị ảnh hưởng, mâu thuẫn Điều 7 (“số công bố thuộc quyền sở hữu của Bên A”).</w:t>
             </w:r>
           </w:p>
         </w:tc>
@@ -14382,7 +14396,7 @@
                 <w:b w:val="0"/>
                 <w:sz w:val="15"/>
               </w:rPr>
-              <w:t>28</w:t>
+              <w:t>29</w:t>
             </w:r>
           </w:p>
         </w:tc>
@@ -14420,7 +14434,7 @@
                 <w:b w:val="0"/>
                 <w:sz w:val="15"/>
               </w:rPr>
-              <w:t>Mức “bồi thường 50% giá trị đơn hàng bên thứ ba” là khoản ấn định, không gắn với thiệt hại thực tế. Bên B là chủ sở hữu công thức (Hợp đồng OEM) nên có quyền sản xuất tại đơn vị khác khi chấm dứt hợp tác, chỉ cần công bố mới đúng quy định.</w:t>
+              <w:t>Mức “bồi thường 50% giá trị đơn hàng bên thứ ba” là khoản ấn định, không gắn với thiệt hại thực tế. Bên A là chủ sở hữu công thức (Hợp đồng OEM) nên có quyền sản xuất tại đơn vị khác khi chấm dứt hợp tác, chỉ cần công bố mới đúng quy định.</w:t>
             </w:r>
           </w:p>
         </w:tc>
@@ -14479,7 +14493,7 @@
                 <w:b w:val="0"/>
                 <w:sz w:val="15"/>
               </w:rPr>
-              <w:t>29</w:t>
+              <w:t>30</w:t>
             </w:r>
           </w:p>
         </w:tc>
@@ -14517,7 +14531,7 @@
                 <w:b w:val="0"/>
                 <w:sz w:val="15"/>
               </w:rPr>
-              <w:t>Bên A “toàn quyền thanh lý” hàng mang nhãn hiệu Bên B chỉ sau 07 ngày » nguy cơ hàng trôi nổi thị trường, xâm phạm nhãn hiệu.</w:t>
+              <w:t>Bên B “toàn quyền thanh lý” hàng mang nhãn hiệu Bên A chỉ sau 07 ngày » nguy cơ hàng trôi nổi thị trường, xâm phạm nhãn hiệu.</w:t>
             </w:r>
           </w:p>
         </w:tc>
@@ -14576,7 +14590,7 @@
                 <w:b w:val="0"/>
                 <w:sz w:val="15"/>
               </w:rPr>
-              <w:t>32</w:t>
+              <w:t>33</w:t>
             </w:r>
           </w:p>
         </w:tc>
@@ -14673,7 +14687,7 @@
                 <w:b w:val="0"/>
                 <w:sz w:val="15"/>
               </w:rPr>
-              <w:t>35</w:t>
+              <w:t>36</w:t>
             </w:r>
           </w:p>
         </w:tc>
@@ -14711,7 +14725,7 @@
                 <w:b w:val="0"/>
                 <w:sz w:val="15"/>
               </w:rPr>
-              <w:t>Phạt 20% tổng giá trị hợp đồng vượt mức trần 8%; chỉ áp dụng một chiều với Bên B.</w:t>
+              <w:t>Phạt 20% tổng giá trị hợp đồng vượt mức trần 8%; chỉ áp dụng một chiều với Bên A.</w:t>
             </w:r>
           </w:p>
         </w:tc>
@@ -14770,7 +14784,7 @@
                 <w:b w:val="0"/>
                 <w:sz w:val="15"/>
               </w:rPr>
-              <w:t>37</w:t>
+              <w:t>38</w:t>
             </w:r>
           </w:p>
         </w:tc>
@@ -14808,7 +14822,7 @@
                 <w:b w:val="0"/>
                 <w:sz w:val="15"/>
               </w:rPr>
-              <w:t>Bảo mật chung chung, không thời hạn; chưa bảo vệ nhãn hiệu, thiết kế và công thức thuộc sở hữu của Bên B; chưa có điều khoản phạt vi phạm chung đúng luật.</w:t>
+              <w:t>Bảo mật chung chung, không thời hạn; chưa bảo vệ nhãn hiệu, thiết kế và công thức thuộc sở hữu của Bên A; chưa có điều khoản phạt vi phạm chung đúng luật.</w:t>
             </w:r>
           </w:p>
         </w:tc>
@@ -14867,7 +14881,7 @@
                 <w:b w:val="0"/>
                 <w:sz w:val="15"/>
               </w:rPr>
-              <w:t>38</w:t>
+              <w:t>39</w:t>
             </w:r>
           </w:p>
         </w:tc>
@@ -14964,7 +14978,7 @@
                 <w:b w:val="0"/>
                 <w:sz w:val="15"/>
               </w:rPr>
-              <w:t>5</w:t>
+              <w:t>3</w:t>
             </w:r>
           </w:p>
         </w:tc>
@@ -14983,7 +14997,7 @@
                 <w:b w:val="0"/>
                 <w:sz w:val="15"/>
               </w:rPr>
-              <w:t>Điều 1 – Phạm vi đơn giá</w:t>
+              <w:t>Chủ thể – vai trò Bên A/Bên B</w:t>
             </w:r>
           </w:p>
         </w:tc>
@@ -15002,7 +15016,7 @@
                 <w:b w:val="0"/>
                 <w:sz w:val="15"/>
               </w:rPr>
-              <w:t>Đơn giá trọn gói chưa xác định rõ phạm vi, có thể phát sinh chi phí ngoài dự kiến.</w:t>
+              <w:t>Theo thông lệ hợp đồng gia công/OEM, bên đặt gia công (chủ thương hiệu) là Bên A và được ghi trước; bên nhận gia công là Bên B. Đổi vai trò: Bên A = CÔNG TY TNHH DS CORPORATION (bên đặt gia công), Bên B = CÔNG TY TNHH HÓA DƯỢC SHIZENCOS (bên nhận gia công); đổi tương ứng toàn bộ ký hiệu “Bên A”/“Bên B” trong hợp đồng. Bổ sung tài khoản ngân hàng của DS. Việc đổi ký hiệu không làm thay đổi nội dung nghĩa vụ đã thỏa thuận.</w:t>
             </w:r>
           </w:p>
         </w:tc>
@@ -15021,7 +15035,7 @@
                 <w:b w:val="0"/>
                 <w:sz w:val="15"/>
               </w:rPr>
-              <w:t>Luật Thương mại 2005 Điều 183 (thù lao gia công)</w:t>
+              <w:t>Luật Thương mại 2005 Điều 178 (bên đặt gia công – bên nhận gia công)</w:t>
             </w:r>
           </w:p>
         </w:tc>
@@ -15080,7 +15094,7 @@
                 <w:b w:val="0"/>
                 <w:sz w:val="15"/>
               </w:rPr>
-              <w:t>Điều 1 – Bao bì lỗi</w:t>
+              <w:t>Điều 1 – Phạm vi đơn giá</w:t>
             </w:r>
           </w:p>
         </w:tc>
@@ -15099,7 +15113,7 @@
                 <w:b w:val="0"/>
                 <w:sz w:val="15"/>
               </w:rPr>
-              <w:t>Bên B bị tính tiền toàn bộ dịch theo số đặt hàng dù không nhận được thành phẩm; chưa có thủ tục xác nhận lỗi bao bì.</w:t>
+              <w:t>Đơn giá trọn gói chưa xác định rõ phạm vi, có thể phát sinh chi phí ngoài dự kiến.</w:t>
             </w:r>
           </w:p>
         </w:tc>
@@ -15118,7 +15132,7 @@
                 <w:b w:val="0"/>
                 <w:sz w:val="15"/>
               </w:rPr>
-              <w:t>BLDS 2015 Điều 542–553 (hợp đồng gia công)</w:t>
+              <w:t>Luật Thương mại 2005 Điều 183 (thù lao gia công)</w:t>
             </w:r>
           </w:p>
         </w:tc>
@@ -15158,7 +15172,7 @@
                 <w:b w:val="0"/>
                 <w:sz w:val="15"/>
               </w:rPr>
-              <w:t>8</w:t>
+              <w:t>7</w:t>
             </w:r>
           </w:p>
         </w:tc>
@@ -15177,7 +15191,7 @@
                 <w:b w:val="0"/>
                 <w:sz w:val="15"/>
               </w:rPr>
-              <w:t>Điều 1 – Dung sai số lượng</w:t>
+              <w:t>Điều 1 – Bao bì lỗi</w:t>
             </w:r>
           </w:p>
         </w:tc>
@@ -15196,7 +15210,7 @@
                 <w:b w:val="0"/>
                 <w:sz w:val="15"/>
               </w:rPr>
-              <w:t>Dung sai ±5–10% quá rộng so với bao bì nhập khẩu số lượng cố định; Bên B có thể phải nhận thừa hoặc thiếu hàng.</w:t>
+              <w:t>Bên A bị tính tiền toàn bộ dịch theo số đặt hàng dù không nhận được thành phẩm; chưa có thủ tục xác nhận lỗi bao bì.</w:t>
             </w:r>
           </w:p>
         </w:tc>
@@ -15215,7 +15229,7 @@
                 <w:b w:val="0"/>
                 <w:sz w:val="15"/>
               </w:rPr>
-              <w:t>Thỏa thuận thương mại</w:t>
+              <w:t>BLDS 2015 Điều 542–553 (hợp đồng gia công)</w:t>
             </w:r>
           </w:p>
         </w:tc>
@@ -15274,7 +15288,7 @@
                 <w:b w:val="0"/>
                 <w:sz w:val="15"/>
               </w:rPr>
-              <w:t>Điều 1 – Chi phí ngoài đơn giá</w:t>
+              <w:t>Điều 1 – Dung sai số lượng</w:t>
             </w:r>
           </w:p>
         </w:tc>
@@ -15293,7 +15307,7 @@
                 <w:b w:val="0"/>
                 <w:sz w:val="15"/>
               </w:rPr>
-              <w:t>Bên A chỉ “thông báo” chi phí trước khi giao hàng, không cần Bên B đồng ý.</w:t>
+              <w:t>Dung sai ±5–10% quá rộng so với bao bì nhập khẩu số lượng cố định; Bên A có thể phải nhận thừa hoặc thiếu hàng.</w:t>
             </w:r>
           </w:p>
         </w:tc>
@@ -15312,7 +15326,7 @@
                 <w:b w:val="0"/>
                 <w:sz w:val="15"/>
               </w:rPr>
-              <w:t>BLDS 2015 Điều 385 (thỏa thuận hợp đồng)</w:t>
+              <w:t>Thỏa thuận thương mại</w:t>
             </w:r>
           </w:p>
         </w:tc>
@@ -15371,7 +15385,7 @@
                 <w:b w:val="0"/>
                 <w:sz w:val="15"/>
               </w:rPr>
-              <w:t>Điều 1 – Biến thiên nguyên liệu tự nhiên</w:t>
+              <w:t>Điều 1 – Chi phí ngoài đơn giá</w:t>
             </w:r>
           </w:p>
         </w:tc>
@@ -15390,7 +15404,7 @@
                 <w:b w:val="0"/>
                 <w:sz w:val="15"/>
               </w:rPr>
-              <w:t>Chưa có ngưỡng đo được để phân biệt biến thiên tự nhiên với lỗi sản phẩm.</w:t>
+              <w:t>Bên B chỉ “thông báo” chi phí trước khi giao hàng, không cần Bên A đồng ý.</w:t>
             </w:r>
           </w:p>
         </w:tc>
@@ -15409,7 +15423,7 @@
                 <w:b w:val="0"/>
                 <w:sz w:val="15"/>
               </w:rPr>
-              <w:t>Thỏa thuận chất lượng</w:t>
+              <w:t>BLDS 2015 Điều 385 (thỏa thuận hợp đồng)</w:t>
             </w:r>
           </w:p>
         </w:tc>
@@ -15449,7 +15463,7 @@
                 <w:b w:val="0"/>
                 <w:sz w:val="15"/>
               </w:rPr>
-              <w:t>13</w:t>
+              <w:t>11</w:t>
             </w:r>
           </w:p>
         </w:tc>
@@ -15468,7 +15482,7 @@
                 <w:b w:val="0"/>
                 <w:sz w:val="15"/>
               </w:rPr>
-              <w:t>Điều 2 – Đợt thanh toán</w:t>
+              <w:t>Điều 1 – Biến thiên nguyên liệu tự nhiên</w:t>
             </w:r>
           </w:p>
         </w:tc>
@@ -15487,7 +15501,7 @@
                 <w:b w:val="0"/>
                 <w:sz w:val="15"/>
               </w:rPr>
-              <w:t>Tạm ứng 70% quá cao; đợt 2 trả ngay khi Bên A “thông báo hoàn tất”, trước khi Bên B kiểm tra chất lượng.</w:t>
+              <w:t>Chưa có ngưỡng đo được để phân biệt biến thiên tự nhiên với lỗi sản phẩm.</w:t>
             </w:r>
           </w:p>
         </w:tc>
@@ -15506,7 +15520,7 @@
                 <w:b w:val="0"/>
                 <w:sz w:val="15"/>
               </w:rPr>
-              <w:t>Luật Thương mại 2005 Điều 183 (thù lao gia công theo thỏa thuận)</w:t>
+              <w:t>Thỏa thuận chất lượng</w:t>
             </w:r>
           </w:p>
         </w:tc>
@@ -15546,7 +15560,7 @@
                 <w:b w:val="0"/>
                 <w:sz w:val="15"/>
               </w:rPr>
-              <w:t>15</w:t>
+              <w:t>14</w:t>
             </w:r>
           </w:p>
         </w:tc>
@@ -15565,7 +15579,7 @@
                 <w:b w:val="0"/>
                 <w:sz w:val="15"/>
               </w:rPr>
-              <w:t>Điều 3 – Hao hụt bao bì</w:t>
+              <w:t>Điều 2 – Đợt thanh toán</w:t>
             </w:r>
           </w:p>
         </w:tc>
@@ -15584,7 +15598,7 @@
                 <w:b w:val="0"/>
                 <w:sz w:val="15"/>
               </w:rPr>
-              <w:t>Hao hụt 3–10% quá rộng với bao bì nhập khẩu; câu văn trong dự thảo bị cắt dở (“…tồn và hư”); bảng bao bì thiếu mục 3 và nắp dropper/pump.</w:t>
+              <w:t>Tạm ứng 70% quá cao; đợt 2 trả ngay khi Bên B “thông báo hoàn tất”, trước khi Bên A kiểm tra chất lượng.</w:t>
             </w:r>
           </w:p>
         </w:tc>
@@ -15603,7 +15617,7 @@
                 <w:b w:val="0"/>
                 <w:sz w:val="15"/>
               </w:rPr>
-              <w:t>Luật Thương mại 2005 Điều 182 (hoàn trả nguyên liệu, vật liệu dư)</w:t>
+              <w:t>Luật Thương mại 2005 Điều 183 (thù lao gia công theo thỏa thuận)</w:t>
             </w:r>
           </w:p>
         </w:tc>
@@ -15662,7 +15676,7 @@
                 <w:b w:val="0"/>
                 <w:sz w:val="15"/>
               </w:rPr>
-              <w:t>Điều 3 – Duyệt thiết kế bao bì</w:t>
+              <w:t>Điều 3 – Hao hụt bao bì</w:t>
             </w:r>
           </w:p>
         </w:tc>
@@ -15681,7 +15695,7 @@
                 <w:b w:val="0"/>
                 <w:sz w:val="15"/>
               </w:rPr>
-              <w:t>Chưa có thời hạn phản hồi và chưa phân định trách nhiệm khi Bên A đã duyệt sai.</w:t>
+              <w:t>Hao hụt 3–10% quá rộng với bao bì nhập khẩu; câu văn trong dự thảo bị cắt dở (“…tồn và hư”); bảng bao bì thiếu mục 3 và nắp dropper/pump.</w:t>
             </w:r>
           </w:p>
         </w:tc>
@@ -15700,7 +15714,7 @@
                 <w:b w:val="0"/>
                 <w:sz w:val="15"/>
               </w:rPr>
-              <w:t>NĐ 43/2017 (nhãn hàng hóa)</w:t>
+              <w:t>Luật Thương mại 2005 Điều 182 (hoàn trả nguyên liệu, vật liệu dư)</w:t>
             </w:r>
           </w:p>
         </w:tc>
@@ -15759,7 +15773,7 @@
                 <w:b w:val="0"/>
                 <w:sz w:val="15"/>
               </w:rPr>
-              <w:t>Điều 4 – Thời hạn sản xuất</w:t>
+              <w:t>Điều 3 – Duyệt thiết kế bao bì</w:t>
             </w:r>
           </w:p>
         </w:tc>
@@ -15778,7 +15792,7 @@
                 <w:b w:val="0"/>
                 <w:sz w:val="15"/>
               </w:rPr>
-              <w:t>Thời hạn “07–14 ngày” không xác định; không có cam kết lịch sản xuất.</w:t>
+              <w:t>Chưa có thời hạn phản hồi và chưa phân định trách nhiệm khi Bên B đã duyệt sai.</w:t>
             </w:r>
           </w:p>
         </w:tc>
@@ -15797,7 +15811,7 @@
                 <w:b w:val="0"/>
                 <w:sz w:val="15"/>
               </w:rPr>
-              <w:t>BLDS 2015 Điều 278 (thời hạn)</w:t>
+              <w:t>NĐ 43/2017 (nhãn hàng hóa)</w:t>
             </w:r>
           </w:p>
         </w:tc>
@@ -15837,7 +15851,7 @@
                 <w:b w:val="0"/>
                 <w:sz w:val="15"/>
               </w:rPr>
-              <w:t>20</w:t>
+              <w:t>18</w:t>
             </w:r>
           </w:p>
         </w:tc>
@@ -15856,7 +15870,7 @@
                 <w:b w:val="0"/>
                 <w:sz w:val="15"/>
               </w:rPr>
-              <w:t>Điều 5 – Miễn trừ</w:t>
+              <w:t>Điều 4 – Thời hạn sản xuất</w:t>
             </w:r>
           </w:p>
         </w:tc>
@@ -15875,7 +15889,7 @@
                 <w:b w:val="0"/>
                 <w:sz w:val="15"/>
               </w:rPr>
-              <w:t>Miễn trừ quá rộng, áp dụng cho “bất kỳ lỗi nào”.</w:t>
+              <w:t>Thời hạn “07–14 ngày” không xác định; không có cam kết lịch sản xuất.</w:t>
             </w:r>
           </w:p>
         </w:tc>
@@ -15894,7 +15908,7 @@
                 <w:b w:val="0"/>
                 <w:sz w:val="15"/>
               </w:rPr>
-              <w:t>Luật Thương mại 2005 Điều 294 (miễn trách nhiệm)</w:t>
+              <w:t>BLDS 2015 Điều 278 (thời hạn)</w:t>
             </w:r>
           </w:p>
         </w:tc>
@@ -15934,7 +15948,7 @@
                 <w:b w:val="0"/>
                 <w:sz w:val="15"/>
               </w:rPr>
-              <w:t>24</w:t>
+              <w:t>21</w:t>
             </w:r>
           </w:p>
         </w:tc>
@@ -15953,7 +15967,7 @@
                 <w:b w:val="0"/>
                 <w:sz w:val="15"/>
               </w:rPr>
-              <w:t>Điều 6 – Chi phí phát sinh, tiêu chuẩn, mẫu chốt</w:t>
+              <w:t>Điều 5 – Miễn trừ</w:t>
             </w:r>
           </w:p>
         </w:tc>
@@ -15972,7 +15986,7 @@
                 <w:b w:val="0"/>
                 <w:sz w:val="15"/>
               </w:rPr>
-              <w:t>“Giống mẫu chốt từ 90%” không đo lường được, không làm căn cứ nghiệm thu.</w:t>
+              <w:t>Miễn trừ quá rộng, áp dụng cho “bất kỳ lỗi nào”.</w:t>
             </w:r>
           </w:p>
         </w:tc>
@@ -15991,7 +16005,7 @@
                 <w:b w:val="0"/>
                 <w:sz w:val="15"/>
               </w:rPr>
-              <w:t>Thỏa thuận chất lượng</w:t>
+              <w:t>Luật Thương mại 2005 Điều 294 (miễn trách nhiệm)</w:t>
             </w:r>
           </w:p>
         </w:tc>
@@ -16050,7 +16064,7 @@
                 <w:b w:val="0"/>
                 <w:sz w:val="15"/>
               </w:rPr>
-              <w:t>Điều 6 – Bảo quản hàng của Bên B</w:t>
+              <w:t>Điều 6 – Chi phí phát sinh, tiêu chuẩn, mẫu chốt</w:t>
             </w:r>
           </w:p>
         </w:tc>
@@ -16069,7 +16083,7 @@
                 <w:b w:val="0"/>
                 <w:sz w:val="15"/>
               </w:rPr>
-              <w:t>Ngoại lệ “không giao nhận đúng quy định Bên A” không rõ nội dung, có thể dùng để từ chối trách nhiệm.</w:t>
+              <w:t>“Giống mẫu chốt từ 90%” không đo lường được, không làm căn cứ nghiệm thu.</w:t>
             </w:r>
           </w:p>
         </w:tc>
@@ -16088,7 +16102,7 @@
                 <w:b w:val="0"/>
                 <w:sz w:val="15"/>
               </w:rPr>
-              <w:t>Luật Thương mại 2005 Điều 182; BLDS 2015 Điều 542–553</w:t>
+              <w:t>Thỏa thuận chất lượng</w:t>
             </w:r>
           </w:p>
         </w:tc>
@@ -16128,7 +16142,7 @@
                 <w:b w:val="0"/>
                 <w:sz w:val="15"/>
               </w:rPr>
-              <w:t>33</w:t>
+              <w:t>26</w:t>
             </w:r>
           </w:p>
         </w:tc>
@@ -16147,7 +16161,7 @@
                 <w:b w:val="0"/>
                 <w:sz w:val="15"/>
               </w:rPr>
-              <w:t>Điều 7 – Tái sản xuất 6 tháng</w:t>
+              <w:t>Điều 6 – Bảo quản hàng của Bên B</w:t>
             </w:r>
           </w:p>
         </w:tc>
@@ -16166,7 +16180,7 @@
                 <w:b w:val="0"/>
                 <w:sz w:val="15"/>
               </w:rPr>
-              <w:t>Ràng buộc ngầm Bên B phải tái sản xuất trong 06 tháng.</w:t>
+              <w:t>Ngoại lệ “không giao nhận đúng quy định Bên B” không rõ nội dung, có thể dùng để từ chối trách nhiệm.</w:t>
             </w:r>
           </w:p>
         </w:tc>
@@ -16185,7 +16199,7 @@
                 <w:b w:val="0"/>
                 <w:sz w:val="15"/>
               </w:rPr>
-              <w:t>Thỏa thuận thương mại</w:t>
+              <w:t>Luật Thương mại 2005 Điều 182; BLDS 2015 Điều 542–553</w:t>
             </w:r>
           </w:p>
         </w:tc>
@@ -16213,6 +16227,7 @@
         <w:tc>
           <w:tcPr>
             <w:tcW w:type="dxa" w:w="510"/>
+            <w:shd w:val="clear" w:color="auto" w:fill="F6E1E9"/>
           </w:tcPr>
           <w:p>
             <w:pPr>
@@ -16224,13 +16239,14 @@
                 <w:b w:val="0"/>
                 <w:sz w:val="15"/>
               </w:rPr>
-              <w:t>2</w:t>
+              <w:t>34</w:t>
             </w:r>
           </w:p>
         </w:tc>
         <w:tc>
           <w:tcPr>
             <w:tcW w:type="dxa" w:w="1701"/>
+            <w:shd w:val="clear" w:color="auto" w:fill="F6E1E9"/>
           </w:tcPr>
           <w:p>
             <w:pPr>
@@ -16242,13 +16258,14 @@
                 <w:b w:val="0"/>
                 <w:sz w:val="15"/>
               </w:rPr>
-              <w:t>Căn cứ</w:t>
+              <w:t>Điều 7 – Tái sản xuất 6 tháng</w:t>
             </w:r>
           </w:p>
         </w:tc>
         <w:tc>
           <w:tcPr>
             <w:tcW w:type="dxa" w:w="3685"/>
+            <w:shd w:val="clear" w:color="auto" w:fill="F6E1E9"/>
           </w:tcPr>
           <w:p>
             <w:pPr>
@@ -16260,13 +16277,14 @@
                 <w:b w:val="0"/>
                 <w:sz w:val="15"/>
               </w:rPr>
-              <w:t>Thiếu các văn bản chuyên ngành điều chỉnh sản xuất, công bố và ghi nhãn mỹ phẩm.</w:t>
+              <w:t>Ràng buộc ngầm Bên A phải tái sản xuất trong 06 tháng.</w:t>
             </w:r>
           </w:p>
         </w:tc>
         <w:tc>
           <w:tcPr>
             <w:tcW w:type="dxa" w:w="2778"/>
+            <w:shd w:val="clear" w:color="auto" w:fill="F6E1E9"/>
           </w:tcPr>
           <w:p>
             <w:pPr>
@@ -16278,13 +16296,14 @@
                 <w:b w:val="0"/>
                 <w:sz w:val="15"/>
               </w:rPr>
-              <w:t>NĐ 93/2016, NĐ 155/2018, TT 06/2011, NĐ 43/2017, NĐ 111/2021</w:t>
+              <w:t>Thỏa thuận thương mại</w:t>
             </w:r>
           </w:p>
         </w:tc>
         <w:tc>
           <w:tcPr>
             <w:tcW w:type="dxa" w:w="1191"/>
+            <w:shd w:val="clear" w:color="auto" w:fill="F6E1E9"/>
           </w:tcPr>
           <w:p>
             <w:pPr>
@@ -16296,7 +16315,7 @@
                 <w:b w:val="0"/>
                 <w:sz w:val="15"/>
               </w:rPr>
-              <w:t>3 – Có thể nhượng</w:t>
+              <w:t>2 – Quan trọng</w:t>
             </w:r>
           </w:p>
         </w:tc>
@@ -16316,7 +16335,7 @@
                 <w:b w:val="0"/>
                 <w:sz w:val="15"/>
               </w:rPr>
-              <w:t>3</w:t>
+              <w:t>2</w:t>
             </w:r>
           </w:p>
         </w:tc>
@@ -16334,7 +16353,7 @@
                 <w:b w:val="0"/>
                 <w:sz w:val="15"/>
               </w:rPr>
-              <w:t>Chủ thể</w:t>
+              <w:t>Căn cứ</w:t>
             </w:r>
           </w:p>
         </w:tc>
@@ -16352,7 +16371,7 @@
                 <w:b w:val="0"/>
                 <w:sz w:val="15"/>
               </w:rPr>
-              <w:t>Thống nhất thuật ngữ theo Luật Thương mại.</w:t>
+              <w:t>Thiếu các văn bản chuyên ngành điều chỉnh sản xuất, công bố và ghi nhãn mỹ phẩm.</w:t>
             </w:r>
           </w:p>
         </w:tc>
@@ -16370,7 +16389,7 @@
                 <w:b w:val="0"/>
                 <w:sz w:val="15"/>
               </w:rPr>
-              <w:t>Luật Thương mại 2005 Điều 178</w:t>
+              <w:t>NĐ 93/2016, NĐ 155/2018, TT 06/2011, NĐ 43/2017, NĐ 111/2021</w:t>
             </w:r>
           </w:p>
         </w:tc>
@@ -16408,7 +16427,7 @@
                 <w:b w:val="0"/>
                 <w:sz w:val="15"/>
               </w:rPr>
-              <w:t>12</w:t>
+              <w:t>4</w:t>
             </w:r>
           </w:p>
         </w:tc>
@@ -16426,7 +16445,7 @@
                 <w:b w:val="0"/>
                 <w:sz w:val="15"/>
               </w:rPr>
-              <w:t>Điều 2 – Lãi chậm trả</w:t>
+              <w:t>Điều 3 – Hồ sơ nguyên liệu do bên đặt gia công cung cấp</w:t>
             </w:r>
           </w:p>
         </w:tc>
@@ -16444,7 +16463,7 @@
                 <w:b w:val="0"/>
                 <w:sz w:val="15"/>
               </w:rPr>
-              <w:t>Áp lãi suất của một ngân hàng cụ thể không phải cách xác định theo luật, dễ tranh chấp.</w:t>
+              <w:t>Dự thảo thiếu chữ (“cung cấp A”).</w:t>
             </w:r>
           </w:p>
         </w:tc>
@@ -16462,7 +16481,7 @@
                 <w:b w:val="0"/>
                 <w:sz w:val="15"/>
               </w:rPr>
-              <w:t>Luật Thương mại 2005 Điều 306</w:t>
+              <w:t>Chỉnh sửa văn bản</w:t>
             </w:r>
           </w:p>
         </w:tc>
@@ -16500,7 +16519,7 @@
                 <w:b w:val="0"/>
                 <w:sz w:val="15"/>
               </w:rPr>
-              <w:t>22</w:t>
+              <w:t>13</w:t>
             </w:r>
           </w:p>
         </w:tc>
@@ -16518,7 +16537,7 @@
                 <w:b w:val="0"/>
                 <w:sz w:val="15"/>
               </w:rPr>
-              <w:t>Điều 6 – An toàn thành phần</w:t>
+              <w:t>Điều 2 – Lãi chậm trả</w:t>
             </w:r>
           </w:p>
         </w:tc>
@@ -16536,7 +16555,7 @@
                 <w:b w:val="0"/>
                 <w:sz w:val="15"/>
               </w:rPr>
-              <w:t>Bổ sung chuẩn tuân thủ cụ thể.</w:t>
+              <w:t>Áp lãi suất của một ngân hàng cụ thể không phải cách xác định theo luật, dễ tranh chấp.</w:t>
             </w:r>
           </w:p>
         </w:tc>
@@ -16554,7 +16573,7 @@
                 <w:b w:val="0"/>
                 <w:sz w:val="15"/>
               </w:rPr>
-              <w:t>Thông tư 06/2011/TT-BYT; Hiệp định mỹ phẩm ASEAN</w:t>
+              <w:t>Luật Thương mại 2005 Điều 306</w:t>
             </w:r>
           </w:p>
         </w:tc>
@@ -16592,7 +16611,7 @@
                 <w:b w:val="0"/>
                 <w:sz w:val="15"/>
               </w:rPr>
-              <w:t>26</w:t>
+              <w:t>23</w:t>
             </w:r>
           </w:p>
         </w:tc>
@@ -16610,7 +16629,7 @@
                 <w:b w:val="0"/>
                 <w:sz w:val="15"/>
               </w:rPr>
-              <w:t>Điều 6 – Đối chiếu vật tư, thanh toán, lưu kho</w:t>
+              <w:t>Điều 6 – An toàn thành phần</w:t>
             </w:r>
           </w:p>
         </w:tc>
@@ -16628,7 +16647,7 @@
                 <w:b w:val="0"/>
                 <w:sz w:val="15"/>
               </w:rPr>
-              <w:t>Hao hụt 3–10% mâu thuẫn định mức mới; phí lưu kho ghi đ/m² (Điều 6) nhưng đ/m³ (Điều 7); thời gian miễn phí chỉ 15 ngày.</w:t>
+              <w:t>Bổ sung chuẩn tuân thủ cụ thể.</w:t>
             </w:r>
           </w:p>
         </w:tc>
@@ -16646,7 +16665,7 @@
                 <w:b w:val="0"/>
                 <w:sz w:val="15"/>
               </w:rPr>
-              <w:t>Thỏa thuận thương mại</w:t>
+              <w:t>Thông tư 06/2011/TT-BYT; Hiệp định mỹ phẩm ASEAN</w:t>
             </w:r>
           </w:p>
         </w:tc>
@@ -16684,7 +16703,7 @@
                 <w:b w:val="0"/>
                 <w:sz w:val="15"/>
               </w:rPr>
-              <w:t>30</w:t>
+              <w:t>27</w:t>
             </w:r>
           </w:p>
         </w:tc>
@@ -16702,7 +16721,7 @@
                 <w:b w:val="0"/>
                 <w:sz w:val="15"/>
               </w:rPr>
-              <w:t>Điều 7 – Giấy tờ Bên B</w:t>
+              <w:t>Điều 6 – Đối chiếu vật tư, thanh toán, lưu kho</w:t>
             </w:r>
           </w:p>
         </w:tc>
@@ -16720,7 +16739,7 @@
                 <w:b w:val="0"/>
                 <w:sz w:val="15"/>
               </w:rPr>
-              <w:t>Nhãn hiệu đang trong thời gian thẩm định chỉ có đơn đăng ký.</w:t>
+              <w:t>Hao hụt 3–10% mâu thuẫn định mức mới; phí lưu kho ghi đ/m² (Điều 6) nhưng đ/m³ (Điều 7); thời gian miễn phí chỉ 15 ngày.</w:t>
             </w:r>
           </w:p>
         </w:tc>
@@ -16738,7 +16757,7 @@
                 <w:b w:val="0"/>
                 <w:sz w:val="15"/>
               </w:rPr>
-              <w:t>Luật Sở hữu trí tuệ</w:t>
+              <w:t>Thỏa thuận thương mại</w:t>
             </w:r>
           </w:p>
         </w:tc>
@@ -16794,7 +16813,7 @@
                 <w:b w:val="0"/>
                 <w:sz w:val="15"/>
               </w:rPr>
-              <w:t>Điều 7 – Lỗi bao bì, nhận hàng</w:t>
+              <w:t>Điều 7 – Giấy tờ Bên B</w:t>
             </w:r>
           </w:p>
         </w:tc>
@@ -16812,7 +16831,7 @@
                 <w:b w:val="0"/>
                 <w:sz w:val="15"/>
               </w:rPr>
-              <w:t>Bắt buộc Bên B (ở Hà Nội) xuống nhà máy; thời hạn lưu kho không thống nhất với Điều 6.</w:t>
+              <w:t>Nhãn hiệu đang trong thời gian thẩm định chỉ có đơn đăng ký.</w:t>
             </w:r>
           </w:p>
         </w:tc>
@@ -16830,7 +16849,7 @@
                 <w:b w:val="0"/>
                 <w:sz w:val="15"/>
               </w:rPr>
-              <w:t>Thỏa thuận vận hành</w:t>
+              <w:t>Luật Sở hữu trí tuệ</w:t>
             </w:r>
           </w:p>
         </w:tc>
@@ -16868,7 +16887,7 @@
                 <w:b w:val="0"/>
                 <w:sz w:val="15"/>
               </w:rPr>
-              <w:t>34</w:t>
+              <w:t>32</w:t>
             </w:r>
           </w:p>
         </w:tc>
@@ -16886,7 +16905,7 @@
                 <w:b w:val="0"/>
                 <w:sz w:val="15"/>
               </w:rPr>
-              <w:t>Điều 7 – Lưu hành hàng không do Bên A sản xuất</w:t>
+              <w:t>Điều 7 – Lỗi bao bì, nhận hàng</w:t>
             </w:r>
           </w:p>
         </w:tc>
@@ -16904,7 +16923,7 @@
                 <w:b w:val="0"/>
                 <w:sz w:val="15"/>
               </w:rPr>
-              <w:t>Giới hạn trách nhiệm đúng phạm vi hành vi.</w:t>
+              <w:t>Bắt buộc Bên A (ở Hà Nội) xuống nhà máy; thời hạn lưu kho không thống nhất với Điều 6.</w:t>
             </w:r>
           </w:p>
         </w:tc>
@@ -16922,7 +16941,7 @@
                 <w:b w:val="0"/>
                 <w:sz w:val="15"/>
               </w:rPr>
-              <w:t>Thông tư 06/2011/TT-BYT</w:t>
+              <w:t>Thỏa thuận vận hành</w:t>
             </w:r>
           </w:p>
         </w:tc>
@@ -16960,7 +16979,7 @@
                 <w:b w:val="0"/>
                 <w:sz w:val="15"/>
               </w:rPr>
-              <w:t>36</w:t>
+              <w:t>35</w:t>
             </w:r>
           </w:p>
         </w:tc>
@@ -16978,7 +16997,7 @@
                 <w:b w:val="0"/>
                 <w:sz w:val="15"/>
               </w:rPr>
-              <w:t>Điều 8 – Kênh trao đổi</w:t>
+              <w:t>Điều 7 – Lưu hành hàng không do Bên A sản xuất</w:t>
             </w:r>
           </w:p>
         </w:tc>
@@ -16996,7 +17015,7 @@
                 <w:b w:val="0"/>
                 <w:sz w:val="15"/>
               </w:rPr>
-              <w:t>Xác định địa chỉ email chính thức có giá trị xác nhận.</w:t>
+              <w:t>Giới hạn trách nhiệm đúng phạm vi hành vi.</w:t>
             </w:r>
           </w:p>
         </w:tc>
@@ -17014,7 +17033,7 @@
                 <w:b w:val="0"/>
                 <w:sz w:val="15"/>
               </w:rPr>
-              <w:t>Luật Giao dịch điện tử 2023</w:t>
+              <w:t>Thông tư 06/2011/TT-BYT</w:t>
             </w:r>
           </w:p>
         </w:tc>
@@ -17052,7 +17071,7 @@
                 <w:b w:val="0"/>
                 <w:sz w:val="15"/>
               </w:rPr>
-              <w:t>39</w:t>
+              <w:t>37</w:t>
             </w:r>
           </w:p>
         </w:tc>
@@ -17070,7 +17089,7 @@
                 <w:b w:val="0"/>
                 <w:sz w:val="15"/>
               </w:rPr>
-              <w:t>Điều 9 – Bất khả kháng kéo dài</w:t>
+              <w:t>Điều 8 – Kênh trao đổi</w:t>
             </w:r>
           </w:p>
         </w:tc>
@@ -17088,7 +17107,7 @@
                 <w:b w:val="0"/>
                 <w:sz w:val="15"/>
               </w:rPr>
-              <w:t>Chưa có lối ra khi bất khả kháng kéo dài.</w:t>
+              <w:t>Xác định địa chỉ email chính thức có giá trị xác nhận.</w:t>
             </w:r>
           </w:p>
         </w:tc>
@@ -17106,7 +17125,7 @@
                 <w:b w:val="0"/>
                 <w:sz w:val="15"/>
               </w:rPr>
-              <w:t>BLDS 2015 Điều 156; Luật Thương mại 2005 Điều 294–296</w:t>
+              <w:t>Luật Giao dịch điện tử 2023</w:t>
             </w:r>
           </w:p>
         </w:tc>
@@ -17162,6 +17181,98 @@
                 <w:b w:val="0"/>
                 <w:sz w:val="15"/>
               </w:rPr>
+              <w:t>Điều 9 – Bất khả kháng kéo dài</w:t>
+            </w:r>
+          </w:p>
+        </w:tc>
+        <w:tc>
+          <w:tcPr>
+            <w:tcW w:type="dxa" w:w="3685"/>
+          </w:tcPr>
+          <w:p>
+            <w:pPr>
+              <w:spacing w:after="0"/>
+            </w:pPr>
+            <w:r/>
+            <w:r>
+              <w:rPr>
+                <w:b w:val="0"/>
+                <w:sz w:val="15"/>
+              </w:rPr>
+              <w:t>Chưa có lối ra khi bất khả kháng kéo dài.</w:t>
+            </w:r>
+          </w:p>
+        </w:tc>
+        <w:tc>
+          <w:tcPr>
+            <w:tcW w:type="dxa" w:w="2778"/>
+          </w:tcPr>
+          <w:p>
+            <w:pPr>
+              <w:spacing w:after="0"/>
+            </w:pPr>
+            <w:r/>
+            <w:r>
+              <w:rPr>
+                <w:b w:val="0"/>
+                <w:sz w:val="15"/>
+              </w:rPr>
+              <w:t>BLDS 2015 Điều 156; Luật Thương mại 2005 Điều 294–296</w:t>
+            </w:r>
+          </w:p>
+        </w:tc>
+        <w:tc>
+          <w:tcPr>
+            <w:tcW w:type="dxa" w:w="1191"/>
+          </w:tcPr>
+          <w:p>
+            <w:pPr>
+              <w:spacing w:after="0"/>
+            </w:pPr>
+            <w:r/>
+            <w:r>
+              <w:rPr>
+                <w:b w:val="0"/>
+                <w:sz w:val="15"/>
+              </w:rPr>
+              <w:t>3 – Có thể nhượng</w:t>
+            </w:r>
+          </w:p>
+        </w:tc>
+      </w:tr>
+      <w:tr>
+        <w:tc>
+          <w:tcPr>
+            <w:tcW w:type="dxa" w:w="510"/>
+          </w:tcPr>
+          <w:p>
+            <w:pPr>
+              <w:spacing w:after="0"/>
+            </w:pPr>
+            <w:r/>
+            <w:r>
+              <w:rPr>
+                <w:b w:val="0"/>
+                <w:sz w:val="15"/>
+              </w:rPr>
+              <w:t>41</w:t>
+            </w:r>
+          </w:p>
+        </w:tc>
+        <w:tc>
+          <w:tcPr>
+            <w:tcW w:type="dxa" w:w="1701"/>
+          </w:tcPr>
+          <w:p>
+            <w:pPr>
+              <w:spacing w:after="0"/>
+            </w:pPr>
+            <w:r/>
+            <w:r>
+              <w:rPr>
+                <w:b w:val="0"/>
+                <w:sz w:val="15"/>
+              </w:rPr>
               <w:t>Điều 10 – Số bản, phụ lục</w:t>
             </w:r>
           </w:p>
@@ -17180,7 +17291,7 @@
                 <w:b w:val="0"/>
                 <w:sz w:val="15"/>
               </w:rPr>
-              <w:t>Bên B cần thêm bản hợp đồng cho hồ sơ công bố; bổ sung danh mục phụ lục.</w:t>
+              <w:t>Bên A cần thêm bản hợp đồng cho hồ sơ công bố; bổ sung danh mục phụ lục.</w:t>
             </w:r>
           </w:p>
         </w:tc>

</xml_diff>